<commit_message>
Corrección de ortografía y saltos de página. Pendiente respuestas individuales(33).
</commit_message>
<xml_diff>
--- a/TP_ProgramacionSobreRedes_2026.docx
+++ b/TP_ProgramacionSobreRedes_2026.docx
@@ -3203,7 +3203,6 @@
         <w:pStyle w:val="Ttulo1"/>
       </w:pPr>
       <w:bookmarkStart w:id="1" w:name="_Toc227879394"/>
-      <w:proofErr w:type="gramStart"/>
       <w:r>
         <w:rPr>
           <w:color w:val="2E75B6"/>
@@ -3212,11 +3211,7 @@
         <w:t xml:space="preserve">1.  </w:t>
       </w:r>
       <w:r>
-        <w:t>¿</w:t>
-      </w:r>
-      <w:proofErr w:type="gramEnd"/>
-      <w:r>
-        <w:t>Qué es una VLAN?</w:t>
+        <w:t>¿Qué es una VLAN?</w:t>
       </w:r>
       <w:bookmarkEnd w:id="1"/>
     </w:p>
@@ -3277,7 +3272,6 @@
         <w:pStyle w:val="Ttulo1"/>
       </w:pPr>
       <w:bookmarkStart w:id="2" w:name="_Toc227879395"/>
-      <w:proofErr w:type="gramStart"/>
       <w:r>
         <w:rPr>
           <w:color w:val="2E75B6"/>
@@ -3285,11 +3279,7 @@
         <w:t xml:space="preserve">2.  </w:t>
       </w:r>
       <w:r>
-        <w:t>¿</w:t>
-      </w:r>
-      <w:proofErr w:type="gramEnd"/>
-      <w:r>
-        <w:t>Qué es una VPN?</w:t>
+        <w:t>¿Qué es una VPN?</w:t>
       </w:r>
       <w:bookmarkEnd w:id="2"/>
     </w:p>
@@ -3309,10 +3299,7 @@
         <w:t>s una conexión privada entre su dispositivo y el resto de Internet. Las organizaciones modernas requieren que los empleados accedan a los datos empresariales confidenciales a través de Internet, por ejemplo, mientras trabajan de forma remota o mientras suben archivos a un servidor en la nube. La transferencia de datos a través de Internet crea riesgos de acceso no autorizado a los datos a medida que viajan por la red. Una VPN establece una conexión de red privada entre dispositivos a través de Internet, lo que permite a los usuarios transmitir datos de forma segura y anónima a través de redes públicas. Enmascara las direcciones IP de los usuarios y cifra los datos, lo que los hace ilegibles para cualquier persona no autorizada a recibirlos.</w:t>
       </w:r>
       <w:r>
-        <w:t xml:space="preserve"> Las VPN cumplen con tres funciones principales Privacidad, Anonimato y Seguridad</w:t>
-      </w:r>
-      <w:r>
-        <w:t>.</w:t>
+        <w:t xml:space="preserve"> Las VPN cumplen con tres funciones principales Privacidad, Anonimato y Seguridad.</w:t>
       </w:r>
     </w:p>
     <w:p>
@@ -3333,7 +3320,6 @@
         <w:pStyle w:val="Ttulo1"/>
       </w:pPr>
       <w:bookmarkStart w:id="3" w:name="_Toc227879396"/>
-      <w:proofErr w:type="gramStart"/>
       <w:r>
         <w:rPr>
           <w:color w:val="2E75B6"/>
@@ -3341,11 +3327,7 @@
         <w:t xml:space="preserve">3.  </w:t>
       </w:r>
       <w:r>
-        <w:t>¿</w:t>
-      </w:r>
-      <w:proofErr w:type="gramEnd"/>
-      <w:r>
-        <w:t>Qué es una SAN?</w:t>
+        <w:t>¿Qué es una SAN?</w:t>
       </w:r>
       <w:bookmarkEnd w:id="3"/>
     </w:p>
@@ -3909,7 +3891,6 @@
         <w:pStyle w:val="Ttulo1"/>
       </w:pPr>
       <w:bookmarkStart w:id="5" w:name="_Toc227879398"/>
-      <w:proofErr w:type="gramStart"/>
       <w:r>
         <w:rPr>
           <w:color w:val="2E75B6"/>
@@ -3917,11 +3898,7 @@
         <w:t xml:space="preserve">5.  </w:t>
       </w:r>
       <w:r>
-        <w:t>¿</w:t>
-      </w:r>
-      <w:proofErr w:type="gramEnd"/>
-      <w:r>
-        <w:t>Qué es un protocolo de comunicaciones?</w:t>
+        <w:t>¿Qué es un protocolo de comunicaciones?</w:t>
       </w:r>
       <w:bookmarkEnd w:id="5"/>
     </w:p>
@@ -5849,7 +5826,7 @@
           <w:noProof/>
         </w:rPr>
         <w:drawing>
-          <wp:inline distT="0" distB="0" distL="0" distR="0" wp14:anchorId="38E6062C" wp14:editId="3EB25C5D">
+          <wp:inline distT="0" distB="0" distL="0" distR="0" wp14:anchorId="38E6062C" wp14:editId="355BBCFF">
             <wp:extent cx="3066447" cy="2307047"/>
             <wp:effectExtent l="0" t="0" r="635" b="0"/>
             <wp:docPr id="3" name="Imagen 3"/>
@@ -6139,10 +6116,7 @@
         <w:contextualSpacing/>
       </w:pPr>
       <w:r>
-        <w:t>Los datos circulan en una dirección (o ambas en versiones modernas)</w:t>
-      </w:r>
-      <w:r>
-        <w:t>.</w:t>
+        <w:t>Los datos circulan en una dirección (o ambas en versiones modernas).</w:t>
       </w:r>
     </w:p>
     <w:p>
@@ -6156,10 +6130,7 @@
         <w:contextualSpacing/>
       </w:pPr>
       <w:r>
-        <w:t>Cada nodo actúa como repetidor</w:t>
-      </w:r>
-      <w:r>
-        <w:t>.</w:t>
+        <w:t>Cada nodo actúa como repetidor.</w:t>
       </w:r>
     </w:p>
     <w:p>
@@ -6173,10 +6144,7 @@
         <w:contextualSpacing/>
       </w:pPr>
       <w:r>
-        <w:t>Puede ser eficiente, pero una falla puede afectar toda la red</w:t>
-      </w:r>
-      <w:r>
-        <w:t>.</w:t>
+        <w:t>Puede ser eficiente, pero una falla puede afectar toda la red.</w:t>
       </w:r>
     </w:p>
     <w:p>
@@ -6346,7 +6314,7 @@
           <w:noProof/>
         </w:rPr>
         <w:drawing>
-          <wp:inline distT="0" distB="0" distL="0" distR="0" wp14:anchorId="3085046D" wp14:editId="7A4B8821">
+          <wp:inline distT="0" distB="0" distL="0" distR="0" wp14:anchorId="3085046D" wp14:editId="1AFEA063">
             <wp:extent cx="2996887" cy="1685925"/>
             <wp:effectExtent l="0" t="0" r="0" b="0"/>
             <wp:docPr id="6" name="Imagen 6" descr="Descubriendo las Características de la Topología Malla en Redes: Todo lo que Necesitas Saber - TMagazine - líder en noticias de tendencias"/>
@@ -6447,10 +6415,7 @@
         <w:contextualSpacing/>
       </w:pPr>
       <w:r>
-        <w:t>Muy utilizada en redes empresariales</w:t>
-      </w:r>
-      <w:r>
-        <w:t>.</w:t>
+        <w:t>Muy utilizada en redes empresariales.</w:t>
       </w:r>
     </w:p>
     <w:p>
@@ -6464,10 +6429,7 @@
         <w:contextualSpacing/>
       </w:pPr>
       <w:r>
-        <w:t>Permite segmentar y organizar la red</w:t>
-      </w:r>
-      <w:r>
-        <w:t>.</w:t>
+        <w:t>Permite segmentar y organizar la red.</w:t>
       </w:r>
     </w:p>
     <w:p>
@@ -6481,10 +6443,7 @@
         <w:contextualSpacing/>
       </w:pPr>
       <w:r>
-        <w:t>Depende de los nodos superiores</w:t>
-      </w:r>
-      <w:r>
-        <w:t>.</w:t>
+        <w:t>Depende de los nodos superiores.</w:t>
       </w:r>
     </w:p>
     <w:p>
@@ -6922,15 +6881,7 @@
       </w:r>
       <w:r>
         <w:br/>
-        <w:t xml:space="preserve"> Todas comparten la idea de </w:t>
-      </w:r>
-      <w:proofErr w:type="gramStart"/>
-      <w:r>
-        <w:t>modular datos</w:t>
-      </w:r>
-      <w:proofErr w:type="gramEnd"/>
-      <w:r>
-        <w:t xml:space="preserve"> sobre un medio electromagnético, pero difieren mucho en objetivos y diseño. Las principales familias son:</w:t>
+        <w:t xml:space="preserve"> Todas comparten la idea de modular datos sobre un medio electromagnético, pero difieren mucho en objetivos y diseño. Las principales familias son:</w:t>
       </w:r>
     </w:p>
     <w:p>
@@ -7239,12 +7190,6 @@
       </w:r>
     </w:p>
     <w:p>
-      <w:r>
-        <w:lastRenderedPageBreak/>
-        <w:br w:type="page"/>
-      </w:r>
-    </w:p>
-    <w:p>
       <w:pPr>
         <w:pBdr>
           <w:bottom w:val="single" w:sz="2" w:space="1" w:color="CCCCCC"/>
@@ -7262,7 +7207,6 @@
         <w:pStyle w:val="Ttulo1"/>
       </w:pPr>
       <w:bookmarkStart w:id="13" w:name="_Toc227879406"/>
-      <w:proofErr w:type="gramStart"/>
       <w:r>
         <w:rPr>
           <w:color w:val="2E75B6"/>
@@ -7270,11 +7214,7 @@
         <w:t xml:space="preserve">13.  </w:t>
       </w:r>
       <w:r>
-        <w:t>¿</w:t>
-      </w:r>
-      <w:proofErr w:type="gramEnd"/>
-      <w:r>
-        <w:t>Qué es un Proxy?</w:t>
+        <w:t>¿Qué es un Proxy?</w:t>
       </w:r>
       <w:bookmarkEnd w:id="13"/>
     </w:p>
@@ -7953,7 +7893,6 @@
         <w:pStyle w:val="Ttulo1"/>
       </w:pPr>
       <w:bookmarkStart w:id="17" w:name="_Toc227879410"/>
-      <w:proofErr w:type="gramStart"/>
       <w:r>
         <w:rPr>
           <w:color w:val="2E75B6"/>
@@ -7961,11 +7900,7 @@
         <w:t xml:space="preserve">17.  </w:t>
       </w:r>
       <w:r>
-        <w:t>¿</w:t>
-      </w:r>
-      <w:proofErr w:type="gramEnd"/>
-      <w:r>
-        <w:t>Qué es un Firewall?</w:t>
+        <w:t>¿Qué es un Firewall?</w:t>
       </w:r>
       <w:bookmarkEnd w:id="17"/>
     </w:p>
@@ -8115,7 +8050,6 @@
         <w:pStyle w:val="Ttulo1"/>
       </w:pPr>
       <w:bookmarkStart w:id="18" w:name="_Toc227879411"/>
-      <w:proofErr w:type="gramStart"/>
       <w:r>
         <w:rPr>
           <w:color w:val="2E75B6"/>
@@ -8123,11 +8057,7 @@
         <w:t xml:space="preserve">18.  </w:t>
       </w:r>
       <w:r>
-        <w:t>¿</w:t>
-      </w:r>
-      <w:proofErr w:type="gramEnd"/>
-      <w:r>
-        <w:t>Qué es una DMZ?</w:t>
+        <w:t>¿Qué es una DMZ?</w:t>
       </w:r>
       <w:bookmarkEnd w:id="18"/>
     </w:p>
@@ -8316,11 +8246,8 @@
     </w:p>
     <w:p>
       <w:pPr>
-        <w:numPr>
-          <w:ilvl w:val="0"/>
-          <w:numId w:val="5"/>
-        </w:numPr>
         <w:spacing w:line="276" w:lineRule="auto"/>
+        <w:ind w:left="720"/>
       </w:pPr>
     </w:p>
     <w:p>
@@ -8359,11 +8286,6 @@
       </w:r>
       <w:r>
         <w:t xml:space="preserve"> en la DMZ. El tráfico externo llega a ese proxy; desde ahí solo se permite comunicación estrictamente necesaria hacia los sistemas internos. Eso reduce superficie de ataque.</w:t>
-      </w:r>
-    </w:p>
-    <w:p>
-      <w:r>
-        <w:br w:type="page"/>
       </w:r>
     </w:p>
     <w:p>
@@ -8384,7 +8306,6 @@
         <w:pStyle w:val="Ttulo1"/>
       </w:pPr>
       <w:bookmarkStart w:id="19" w:name="_Toc227879412"/>
-      <w:proofErr w:type="gramStart"/>
       <w:r>
         <w:rPr>
           <w:color w:val="2E75B6"/>
@@ -8392,11 +8313,7 @@
         <w:t xml:space="preserve">19.  </w:t>
       </w:r>
       <w:r>
-        <w:t>¿</w:t>
-      </w:r>
-      <w:proofErr w:type="gramEnd"/>
-      <w:r>
-        <w:t>Qué es un Gateway?</w:t>
+        <w:t>¿Qué es un Gateway?</w:t>
       </w:r>
       <w:bookmarkEnd w:id="19"/>
     </w:p>
@@ -8472,6 +8389,7 @@
           <w:b/>
           <w:bCs/>
         </w:rPr>
+        <w:lastRenderedPageBreak/>
         <w:t>Funcionamiento:</w:t>
       </w:r>
       <w:r>
@@ -8547,7 +8465,6 @@
         <w:pStyle w:val="Ttulo1"/>
       </w:pPr>
       <w:bookmarkStart w:id="20" w:name="_Toc227879413"/>
-      <w:proofErr w:type="gramStart"/>
       <w:r>
         <w:rPr>
           <w:color w:val="2E75B6"/>
@@ -8555,11 +8472,7 @@
         <w:t xml:space="preserve">20.  </w:t>
       </w:r>
       <w:r>
-        <w:t>¿</w:t>
-      </w:r>
-      <w:proofErr w:type="gramEnd"/>
-      <w:r>
-        <w:t>Qué significa NBL según Microsoft?</w:t>
+        <w:t>¿Qué significa NBL según Microsoft?</w:t>
       </w:r>
       <w:bookmarkEnd w:id="20"/>
     </w:p>
@@ -8708,15 +8621,7 @@
         <w:spacing w:after="80"/>
       </w:pPr>
       <w:r>
-        <w:t xml:space="preserve">Desde el punto de vista interno, esto permite que distintos drivers —por </w:t>
-      </w:r>
-      <w:proofErr w:type="gramStart"/>
-      <w:r>
-        <w:t>ejemplo</w:t>
-      </w:r>
-      <w:proofErr w:type="gramEnd"/>
-      <w:r>
-        <w:t xml:space="preserve"> </w:t>
+        <w:t xml:space="preserve">Desde el punto de vista interno, esto permite que distintos drivers —por ejemplo </w:t>
       </w:r>
       <w:proofErr w:type="spellStart"/>
       <w:r>
@@ -12060,18 +11965,10 @@
       </w:r>
       <w:proofErr w:type="spellEnd"/>
       <w:r>
-        <w:t xml:space="preserve">-LAN sobre buena conectividad, </w:t>
-      </w:r>
-      <w:proofErr w:type="gramStart"/>
-      <w:r>
-        <w:t xml:space="preserve">si </w:t>
-      </w:r>
-      <w:r>
-        <w:t xml:space="preserve"> la</w:t>
-      </w:r>
-      <w:proofErr w:type="gramEnd"/>
-      <w:r>
-        <w:t xml:space="preserve"> cuestión</w:t>
+        <w:t xml:space="preserve">-LAN sobre buena conectividad, si </w:t>
+      </w:r>
+      <w:r>
+        <w:t xml:space="preserve"> la cuestión</w:t>
       </w:r>
       <w:r>
         <w:t xml:space="preserve"> fuera costo.</w:t>
@@ -13239,11 +13136,9 @@
             <w:pPr>
               <w:pStyle w:val="Contenidodelatabla"/>
             </w:pPr>
-            <w:proofErr w:type="spellStart"/>
-            <w:r>
-              <w:t>Asimetrico</w:t>
-            </w:r>
-            <w:proofErr w:type="spellEnd"/>
+            <w:r>
+              <w:t>Asimétrico</w:t>
+            </w:r>
           </w:p>
         </w:tc>
         <w:tc>
@@ -13258,11 +13153,9 @@
             <w:pPr>
               <w:pStyle w:val="Contenidodelatabla"/>
             </w:pPr>
-            <w:proofErr w:type="spellStart"/>
-            <w:r>
-              <w:t>Simetrico</w:t>
-            </w:r>
-            <w:proofErr w:type="spellEnd"/>
+            <w:r>
+              <w:t>Simétrico</w:t>
+            </w:r>
             <w:r>
               <w:t xml:space="preserve"> en distancias cortas</w:t>
             </w:r>
@@ -13281,11 +13174,9 @@
             <w:pPr>
               <w:pStyle w:val="Contenidodelatabla"/>
             </w:pPr>
-            <w:proofErr w:type="spellStart"/>
-            <w:r>
-              <w:t>Simetrico</w:t>
-            </w:r>
-            <w:proofErr w:type="spellEnd"/>
+            <w:r>
+              <w:t>Simétrico</w:t>
+            </w:r>
           </w:p>
         </w:tc>
       </w:tr>
@@ -13409,11 +13300,9 @@
             <w:pPr>
               <w:pStyle w:val="Contenidodelatabla"/>
             </w:pPr>
-            <w:proofErr w:type="spellStart"/>
-            <w:r>
-              <w:t>Suceptible</w:t>
-            </w:r>
-            <w:proofErr w:type="spellEnd"/>
+            <w:r>
+              <w:t>Susceptible</w:t>
+            </w:r>
             <w:r>
               <w:t xml:space="preserve"> a interferencias</w:t>
             </w:r>
@@ -13431,11 +13320,9 @@
             <w:pPr>
               <w:pStyle w:val="Contenidodelatabla"/>
             </w:pPr>
-            <w:proofErr w:type="spellStart"/>
-            <w:r>
-              <w:t>Suceptible</w:t>
-            </w:r>
-            <w:proofErr w:type="spellEnd"/>
+            <w:r>
+              <w:t>Susceptible</w:t>
+            </w:r>
             <w:r>
               <w:t xml:space="preserve"> a interferencias</w:t>
             </w:r>
@@ -13457,11 +13344,9 @@
             <w:r>
               <w:t xml:space="preserve">Inmune a interferencias </w:t>
             </w:r>
-            <w:proofErr w:type="spellStart"/>
-            <w:r>
-              <w:t>electromagneticas</w:t>
-            </w:r>
-            <w:proofErr w:type="spellEnd"/>
+            <w:r>
+              <w:t>electromagnéticas</w:t>
+            </w:r>
           </w:p>
         </w:tc>
       </w:tr>

</xml_diff>